<commit_message>
fix: static Contents page in operating manuals
The auto-generated Table of Contents field renders blank in viewers that
don't update fields (PDF/preview/Google Docs), leaving an empty Contents
page. Replaced it with a static, always-populated list of sections.

Co-Authored-By: Claude Opus 4.8 <noreply@anthropic.com>
</commit_message>
<xml_diff>
--- a/nlh-platform/public/manuals/NLH-Operating-Manual-CF.docx
+++ b/nlh-platform/public/manuals/NLH-Operating-Manual-CF.docx
@@ -151,25 +151,259 @@
         <w:t xml:space="preserve">Contents</w:t>
       </w:r>
     </w:p>
-    <w:sdt>
-      <w:sdtPr>
-        <w:alias w:val="Contents"/>
-      </w:sdtPr>
-      <w:sdtContent>
-        <w:p>
-          <w:r>
-            <w:fldChar w:fldCharType="begin" w:dirty="true"/>
-            <w:instrText xml:space="preserve">TOC \h \o "1-2"</w:instrText>
-            <w:fldChar w:fldCharType="separate"/>
-          </w:r>
-        </w:p>
-        <w:p>
-          <w:r>
-            <w:fldChar w:fldCharType="end"/>
-          </w:r>
-        </w:p>
-      </w:sdtContent>
-    </w:sdt>
+    <w:p>
+      <w:pPr>
+        <w:spacing w:after="90" w:line="276"/>
+      </w:pPr>
+      <w:r>
+        <w:rPr>
+          <w:b/>
+          <w:bCs/>
+          <w:color w:val="534AB7"/>
+          <w:sz w:val="22"/>
+          <w:szCs w:val="22"/>
+        </w:rPr>
+        <w:t xml:space="preserve">1.</w:t>
+      </w:r>
+      <w:r>
+        <w:rPr>
+          <w:color w:val="1A1916"/>
+          <w:sz w:val="22"/>
+          <w:szCs w:val="22"/>
+        </w:rPr>
+        <w:t xml:space="preserve">   Welcome</w:t>
+      </w:r>
+    </w:p>
+    <w:p>
+      <w:pPr>
+        <w:spacing w:after="90" w:line="276"/>
+      </w:pPr>
+      <w:r>
+        <w:rPr>
+          <w:b/>
+          <w:bCs/>
+          <w:color w:val="534AB7"/>
+          <w:sz w:val="22"/>
+          <w:szCs w:val="22"/>
+        </w:rPr>
+        <w:t xml:space="preserve">2.</w:t>
+      </w:r>
+      <w:r>
+        <w:rPr>
+          <w:color w:val="1A1916"/>
+          <w:sz w:val="22"/>
+          <w:szCs w:val="22"/>
+        </w:rPr>
+        <w:t xml:space="preserve">   Your Login &amp; Account</w:t>
+      </w:r>
+    </w:p>
+    <w:p>
+      <w:pPr>
+        <w:spacing w:after="90" w:line="276"/>
+      </w:pPr>
+      <w:r>
+        <w:rPr>
+          <w:b/>
+          <w:bCs/>
+          <w:color w:val="534AB7"/>
+          <w:sz w:val="22"/>
+          <w:szCs w:val="22"/>
+        </w:rPr>
+        <w:t xml:space="preserve">3.</w:t>
+      </w:r>
+      <w:r>
+        <w:rPr>
+          <w:color w:val="1A1916"/>
+          <w:sz w:val="22"/>
+          <w:szCs w:val="22"/>
+        </w:rPr>
+        <w:t xml:space="preserve">   The Dashboard</w:t>
+      </w:r>
+    </w:p>
+    <w:p>
+      <w:pPr>
+        <w:spacing w:after="90" w:line="276"/>
+      </w:pPr>
+      <w:r>
+        <w:rPr>
+          <w:b/>
+          <w:bCs/>
+          <w:color w:val="534AB7"/>
+          <w:sz w:val="22"/>
+          <w:szCs w:val="22"/>
+        </w:rPr>
+        <w:t xml:space="preserve">4.</w:t>
+      </w:r>
+      <w:r>
+        <w:rPr>
+          <w:color w:val="1A1916"/>
+          <w:sz w:val="22"/>
+          <w:szCs w:val="22"/>
+        </w:rPr>
+        <w:t xml:space="preserve">   Students</w:t>
+      </w:r>
+    </w:p>
+    <w:p>
+      <w:pPr>
+        <w:spacing w:after="90" w:line="276"/>
+      </w:pPr>
+      <w:r>
+        <w:rPr>
+          <w:b/>
+          <w:bCs/>
+          <w:color w:val="534AB7"/>
+          <w:sz w:val="22"/>
+          <w:szCs w:val="22"/>
+        </w:rPr>
+        <w:t xml:space="preserve">5.</w:t>
+      </w:r>
+      <w:r>
+        <w:rPr>
+          <w:color w:val="1A1916"/>
+          <w:sz w:val="22"/>
+          <w:szCs w:val="22"/>
+        </w:rPr>
+        <w:t xml:space="preserve">   Course Catalogue &amp; Pricing</w:t>
+      </w:r>
+    </w:p>
+    <w:p>
+      <w:pPr>
+        <w:spacing w:after="90" w:line="276"/>
+      </w:pPr>
+      <w:r>
+        <w:rPr>
+          <w:b/>
+          <w:bCs/>
+          <w:color w:val="534AB7"/>
+          <w:sz w:val="22"/>
+          <w:szCs w:val="22"/>
+        </w:rPr>
+        <w:t xml:space="preserve">6.</w:t>
+      </w:r>
+      <w:r>
+        <w:rPr>
+          <w:color w:val="1A1916"/>
+          <w:sz w:val="22"/>
+          <w:szCs w:val="22"/>
+        </w:rPr>
+        <w:t xml:space="preserve">   Ordering Kits</w:t>
+      </w:r>
+    </w:p>
+    <w:p>
+      <w:pPr>
+        <w:spacing w:after="90" w:line="276"/>
+      </w:pPr>
+      <w:r>
+        <w:rPr>
+          <w:b/>
+          <w:bCs/>
+          <w:color w:val="534AB7"/>
+          <w:sz w:val="22"/>
+          <w:szCs w:val="22"/>
+        </w:rPr>
+        <w:t xml:space="preserve">7.</w:t>
+      </w:r>
+      <w:r>
+        <w:rPr>
+          <w:color w:val="1A1916"/>
+          <w:sz w:val="22"/>
+          <w:szCs w:val="22"/>
+        </w:rPr>
+        <w:t xml:space="preserve">   Managing Your Network</w:t>
+      </w:r>
+    </w:p>
+    <w:p>
+      <w:pPr>
+        <w:spacing w:after="90" w:line="276"/>
+      </w:pPr>
+      <w:r>
+        <w:rPr>
+          <w:b/>
+          <w:bCs/>
+          <w:color w:val="534AB7"/>
+          <w:sz w:val="22"/>
+          <w:szCs w:val="22"/>
+        </w:rPr>
+        <w:t xml:space="preserve">8.</w:t>
+      </w:r>
+      <w:r>
+        <w:rPr>
+          <w:color w:val="1A1916"/>
+          <w:sz w:val="22"/>
+          <w:szCs w:val="22"/>
+        </w:rPr>
+        <w:t xml:space="preserve">   Certificates &amp; Parent Communication</w:t>
+      </w:r>
+    </w:p>
+    <w:p>
+      <w:pPr>
+        <w:spacing w:after="90" w:line="276"/>
+      </w:pPr>
+      <w:r>
+        <w:rPr>
+          <w:b/>
+          <w:bCs/>
+          <w:color w:val="534AB7"/>
+          <w:sz w:val="22"/>
+          <w:szCs w:val="22"/>
+        </w:rPr>
+        <w:t xml:space="preserve">9.</w:t>
+      </w:r>
+      <w:r>
+        <w:rPr>
+          <w:color w:val="1A1916"/>
+          <w:sz w:val="22"/>
+          <w:szCs w:val="22"/>
+        </w:rPr>
+        <w:t xml:space="preserve">   Follow-ups &amp; Reminders</w:t>
+      </w:r>
+    </w:p>
+    <w:p>
+      <w:pPr>
+        <w:spacing w:after="90" w:line="276"/>
+      </w:pPr>
+      <w:r>
+        <w:rPr>
+          <w:b/>
+          <w:bCs/>
+          <w:color w:val="534AB7"/>
+          <w:sz w:val="22"/>
+          <w:szCs w:val="22"/>
+        </w:rPr>
+        <w:t xml:space="preserve">10.</w:t>
+      </w:r>
+      <w:r>
+        <w:rPr>
+          <w:color w:val="1A1916"/>
+          <w:sz w:val="22"/>
+          <w:szCs w:val="22"/>
+        </w:rPr>
+        <w:t xml:space="preserve">   Best Practices</w:t>
+      </w:r>
+    </w:p>
+    <w:p>
+      <w:pPr>
+        <w:spacing w:after="90" w:line="276"/>
+      </w:pPr>
+      <w:r>
+        <w:rPr>
+          <w:b/>
+          <w:bCs/>
+          <w:color w:val="534AB7"/>
+          <w:sz w:val="22"/>
+          <w:szCs w:val="22"/>
+        </w:rPr>
+        <w:t xml:space="preserve">11.</w:t>
+      </w:r>
+      <w:r>
+        <w:rPr>
+          <w:color w:val="1A1916"/>
+          <w:sz w:val="22"/>
+          <w:szCs w:val="22"/>
+        </w:rPr>
+        <w:t xml:space="preserve">   Support &amp; Contacts</w:t>
+      </w:r>
+    </w:p>
     <w:p>
       <w:r>
         <w:br w:type="page"/>

</xml_diff>